<commit_message>
Test right-to-left alignment and the outline's text fallback
The Arabic fixture gains paragraphs with jc=left and jc=right, which Word
reads relative to the paragraph direction. The outline test shifts every
paragraph index and expects each entry to find its heading by text.
</commit_message>
<xml_diff>
--- a/tests/reader/dev-fixtures/arabic.docx
+++ b/tests/reader/dev-fixtures/arabic.docx
@@ -34,6 +34,30 @@
           <w:rtl/>
         </w:rPr>
         <w:t>زار الفريق اثني عشر موقعا على طول النهر.</w:t>
+      </w:r>
+    </w:p>
+    <w:p>
+      <w:pPr>
+        <w:bidi/>
+        <w:jc w:val="left"/>
+      </w:pPr>
+      <w:r>
+        <w:rPr>
+          <w:rtl/>
+        </w:rPr>
+        <w:t>فقرة عند بداية السطر</w:t>
+      </w:r>
+    </w:p>
+    <w:p>
+      <w:pPr>
+        <w:bidi/>
+        <w:jc w:val="right"/>
+      </w:pPr>
+      <w:r>
+        <w:rPr>
+          <w:rtl/>
+        </w:rPr>
+        <w:t>فقرة عند نهاية السطر</w:t>
       </w:r>
     </w:p>
     <w:p>

</xml_diff>